<commit_message>
vault backup: 2026-08-30 04:46:45
</commit_message>
<xml_diff>
--- a/説教準備/20260830マルコ3-7-19 「そばに置くために」（新稿）.docx
+++ b/説教準備/20260830マルコ3-7-19 「そばに置くために」（新稿）.docx
@@ -1127,6 +1127,127 @@
           <w:sz w:val="21"/>
         </w:rPr>
         <w:t xml:space="preserve">来た人を迎えるだけで、終わりません。</w:t>
+      </w:r>
+    </w:p>
+    <w:p>
+      <w:pPr>
+        <w:pStyle w:val="a8"/>
+        <w:rPr>
+          <w:rFonts w:ascii="Meiryo UI" w:hAnsi="Meiryo UI"/>
+          <w:sz w:val="21"/>
+        </w:rPr>
+      </w:pPr>
+    </w:p>
+    <w:p>
+      <w:pPr>
+        <w:pStyle w:val="a8"/>
+        <w:rPr>
+          <w:rFonts w:ascii="Meiryo UI" w:hAnsi="Meiryo UI"/>
+          <w:sz w:val="21"/>
+        </w:rPr>
+      </w:pPr>
+      <w:r>
+        <w:rPr>
+          <w:rFonts w:ascii="Meiryo UI" w:hAnsi="Meiryo UI"/>
+          <w:sz w:val="21"/>
+        </w:rPr>
+        <w:t xml:space="preserve">ただし、一つだけ、この後に出てこない地名があります。</w:t>
+      </w:r>
+    </w:p>
+    <w:p>
+      <w:pPr>
+        <w:pStyle w:val="a8"/>
+        <w:rPr>
+          <w:rFonts w:ascii="Meiryo UI" w:hAnsi="Meiryo UI"/>
+          <w:sz w:val="21"/>
+        </w:rPr>
+      </w:pPr>
+      <w:r>
+        <w:rPr>
+          <w:rFonts w:ascii="Meiryo UI" w:hAnsi="Meiryo UI"/>
+          <w:sz w:val="21"/>
+        </w:rPr>
+        <w:t xml:space="preserve">イドマヤです。</w:t>
+      </w:r>
+    </w:p>
+    <w:p>
+      <w:pPr>
+        <w:pStyle w:val="a8"/>
+        <w:rPr>
+          <w:rFonts w:ascii="Meiryo UI" w:hAnsi="Meiryo UI"/>
+          <w:sz w:val="21"/>
+        </w:rPr>
+      </w:pPr>
+      <w:r>
+        <w:rPr>
+          <w:rFonts w:ascii="Meiryo UI" w:hAnsi="Meiryo UI"/>
+          <w:sz w:val="21"/>
+        </w:rPr>
+        <w:t xml:space="preserve">七つの中でいちばん南、エルサレムのさらに向こうにある地方です。</w:t>
+      </w:r>
+    </w:p>
+    <w:p>
+      <w:pPr>
+        <w:pStyle w:val="a8"/>
+        <w:rPr>
+          <w:rFonts w:ascii="Meiryo UI" w:hAnsi="Meiryo UI"/>
+          <w:sz w:val="21"/>
+        </w:rPr>
+      </w:pPr>
+      <w:r>
+        <w:rPr>
+          <w:rFonts w:ascii="Meiryo UI" w:hAnsi="Meiryo UI"/>
+          <w:sz w:val="21"/>
+        </w:rPr>
+        <w:t xml:space="preserve">マルコが書いているイエス様の歩みは、北はシドンまで、南はエルサレムまででした。</w:t>
+      </w:r>
+    </w:p>
+    <w:p>
+      <w:pPr>
+        <w:pStyle w:val="a8"/>
+        <w:rPr>
+          <w:rFonts w:ascii="Meiryo UI" w:hAnsi="Meiryo UI"/>
+          <w:sz w:val="21"/>
+        </w:rPr>
+      </w:pPr>
+      <w:r>
+        <w:rPr>
+          <w:rFonts w:ascii="Meiryo UI" w:hAnsi="Meiryo UI"/>
+          <w:sz w:val="21"/>
+        </w:rPr>
+        <w:t xml:space="preserve">イドマヤは、その先です。</w:t>
+      </w:r>
+    </w:p>
+    <w:p>
+      <w:pPr>
+        <w:pStyle w:val="a8"/>
+        <w:rPr>
+          <w:rFonts w:ascii="Meiryo UI" w:hAnsi="Meiryo UI"/>
+          <w:sz w:val="21"/>
+        </w:rPr>
+      </w:pPr>
+      <w:r>
+        <w:rPr>
+          <w:rFonts w:ascii="Meiryo UI" w:hAnsi="Meiryo UI"/>
+          <w:sz w:val="21"/>
+        </w:rPr>
+        <w:t xml:space="preserve">そこからも来た、と書かれています。</w:t>
+      </w:r>
+    </w:p>
+    <w:p>
+      <w:pPr>
+        <w:pStyle w:val="a8"/>
+        <w:rPr>
+          <w:rFonts w:ascii="Meiryo UI" w:hAnsi="Meiryo UI"/>
+          <w:sz w:val="21"/>
+        </w:rPr>
+      </w:pPr>
+      <w:r>
+        <w:rPr>
+          <w:rFonts w:ascii="Meiryo UI" w:hAnsi="Meiryo UI"/>
+          <w:sz w:val="21"/>
+        </w:rPr>
+        <w:t xml:space="preserve">来た人たちのほうが、イエス様が歩かれた範囲より遠くから来ていることになります。</w:t>
       </w:r>
     </w:p>
     <w:p>

</xml_diff>